<commit_message>
Tag commit ddf7a99b as the reproducibility reference for the corrected paper/README
</commit_message>
<xml_diff>
--- a/CompGraphRAG_Paper.docx
+++ b/CompGraphRAG_Paper.docx
@@ -3902,16 +3902,7 @@
         <w:jc w:val="both"/>
       </w:pPr>
       <w:r>
-        <w:rPr>
-          <w:rFonts w:ascii="Times New Roman" w:cs="Times New Roman" w:eastAsia="Times New Roman" w:hAnsi="Times New Roman"/>
-          <w:b w:val="false"/>
-          <w:bCs w:val="false"/>
-          <w:i w:val="false"/>
-          <w:iCs w:val="false"/>
-          <w:sz w:val="20"/>
-          <w:szCs w:val="20"/>
-        </w:rPr>
-        <w:t xml:space="preserve">The reference implementation, the N=24 benchmark dataset, the evaluation harness (eval/eval_harness.py) used to produce Table II, Fig. 3, and Fig. 5, the baseline runner (baselines/runner.py), and the schema/prompt/rule-configuration artifacts described in Section IV are released under the MIT license at https://github.com/12349/CompGraphRAG. All numbers reported in this revision were regenerated directly from this repository's evaluation harness output. The commit hash corresponding to this manuscript's final results should be tagged at publication time, and the repository README table should be updated to match this version before submission (tracked as a separate follow-up item).</w:t>
+        <w:t>The reference implementation, the N=24 benchmark dataset, the evaluation harness (eval/eval_harness.py) used to produce Table II, Fig. 3, and Fig. 5, the baseline runner (baselines/runner.py), and the schema/prompt/rule-configuration artifacts described in Section IV are released under the MIT license at https://github.com/12349/CompGraphRAG. All numbers reported in this revision were regenerated directly from this repository's evaluation harness output. The exact commit hash corresponding to this manuscript's final results is ddf7a99b36e70e236f7f65f9080ddcc8d16ff632 (tagged as v1.0-paper).</w:t>
       </w:r>
     </w:p>
     <w:p>

</xml_diff>

<commit_message>
chore: Replace CompGraphRAG_Paper.docx with final submission manuscript
</commit_message>
<xml_diff>
--- a/CompGraphRAG_Paper.docx
+++ b/CompGraphRAG_Paper.docx
@@ -66,108 +66,91 @@
     </w:p>
     <w:p>
       <w:pPr>
-        <w:shd w:fill="FFF3CD" w:val="clear"/>
-        <w:spacing w:after="200" w:before="120"/>
-      </w:pPr>
-      <w:r>
-        <w:rPr>
-          <w:rFonts w:ascii="Times New Roman" w:cs="Times New Roman" w:eastAsia="Times New Roman" w:hAnsi="Times New Roman"/>
-          <w:i/>
-          <w:iCs/>
-          <w:color w:val="7A5C00"/>
+        <w:pStyle w:val="Heading2"/>
+        <w:spacing w:after="140" w:before="280"/>
+      </w:pPr>
+      <w:r>
+        <w:rPr>
+          <w:rFonts w:ascii="Times New Roman" w:cs="Times New Roman" w:eastAsia="Times New Roman" w:hAnsi="Times New Roman"/>
+          <w:b/>
+          <w:bCs/>
+          <w:i/>
+          <w:iCs/>
+          <w:sz w:val="22"/>
+          <w:szCs w:val="22"/>
+        </w:rPr>
+        <w:t xml:space="preserve">Abstract</w:t>
+      </w:r>
+    </w:p>
+    <w:p>
+      <w:pPr>
+        <w:spacing w:after="160"/>
+        <w:jc w:val="both"/>
+      </w:pPr>
+      <w:r>
+        <w:rPr>
+          <w:rFonts w:ascii="Times New Roman" w:cs="Times New Roman" w:eastAsia="Times New Roman" w:hAnsi="Times New Roman"/>
+          <w:b w:val="false"/>
+          <w:bCs w:val="false"/>
+          <w:i w:val="false"/>
+          <w:iCs w:val="false"/>
+          <w:sz w:val="22"/>
+          <w:szCs w:val="22"/>
+        </w:rPr>
+        <w:t xml:space="preserve">Enterprise compliance determination — for example, deciding whether a specific healthcare data disclosure satisfies HIPAA mandates — requires reasoning across relationally distributed, heterogeneous documents that include regulations, contracts, clinical policies, and access logs. Standard vector-based Retrieval-Augmented Generation (RAG) treats these documents as flat, isolated chunks and is hypothesized to degrade on multi-hop regulatory queries. Black-box large language model (LLM) outputs also lack auditable justification trails and calibrated uncertainty, which limits their suitability for high-stakes compliance auditing. We present CompGraphRAG, a framework that unifies (1) a schema-based knowledge graph ontology (TBox/ABox) with temporal versioning of regulatory concepts, (2) a formal hybrid retrieval scoring function combining dense bi-encoder similarity, graph-path decay, and Personalized PageRank node authority, (3) a neuro-symbolic rule-check layer that evaluates declarative regulatory exceptions prior to generation, (4) audit-grade explainability via traversable justification subgraphs scored with a quantitative faithfulness metric, and (5) split conformal prediction that furnishes distribution-free confidence sets and routes low-confidence determinations to human review.</w:t>
+      </w:r>
+    </w:p>
+    <w:p>
+      <w:pPr>
+        <w:spacing w:after="160"/>
+        <w:jc w:val="both"/>
+      </w:pPr>
+      <w:r>
+        <w:rPr>
+          <w:rFonts w:ascii="Times New Roman" w:cs="Times New Roman" w:eastAsia="Times New Roman" w:hAnsi="Times New Roman"/>
+          <w:b w:val="false"/>
+          <w:bCs w:val="false"/>
+          <w:i w:val="false"/>
+          <w:iCs w:val="false"/>
+          <w:sz w:val="22"/>
+          <w:szCs w:val="22"/>
+        </w:rPr>
+        <w:t xml:space="preserve">Compliance determination is formalized as a function f: Q × D × G → (d, c, π) and instantiated in a HIPAA case study. This manuscript reports results from a 24-item synthetic HIPAA compliance-QA benchmark (6 items at each of 1-, 2-, 3-, and 4-hop complexity), evaluated with a real sentence-embedding encoder (all-MiniLM-L6-v2) against two fairness-matched baselines that use the identical rule-based answer-readout step as CompGraphRAG: Vector-RAG (pure dense cosine-similarity retrieval) and Naive-RAG (a 0.5/0.5 blend of keyword overlap and dense similarity). This design isolates retrieval architecture as the variable under test, separating it from answer-extraction sophistication. Under this controlled comparison, CompGraphRAG achieved 100.0% overall accuracy (24/24), against 87.5% (21/24) for both the Vector-RAG and Naive-RAG baselines, tying both baselines at 3- and 4-hop and outperforming them at 1- and 2-hop (paired t-test p = 0.0830; Wilcoxon signed-rank p = 0.0833; N = 24). Neither test clears the conventional 0.05 significance threshold, and the effect size (Cohen's d ≈ 0.37) is small-to-medium, so this is reported as a promising but not yet statistically confirmed accuracy advantage, not as proof of the paper's original hop-scaling hypothesis.</w:t>
+      </w:r>
+    </w:p>
+    <w:p>
+      <w:pPr>
+        <w:spacing w:after="160"/>
+        <w:jc w:val="both"/>
+      </w:pPr>
+      <w:r>
+        <w:rPr>
+          <w:rFonts w:ascii="Times New Roman" w:cs="Times New Roman" w:eastAsia="Times New Roman" w:hAnsi="Times New Roman"/>
+          <w:b w:val="false"/>
+          <w:bCs w:val="false"/>
+          <w:i w:val="false"/>
+          <w:iCs w:val="false"/>
+          <w:sz w:val="22"/>
+          <w:szCs w:val="22"/>
+        </w:rPr>
+        <w:t xml:space="preserve">The same evaluation supports two further claims: CompGraphRAG's justification subgraphs and generated explanations are independently, non-tautologically faithful to retrieved evidence (mean F1 = 0.9679, verified against per-item natural-language generation with genuine content-dependent variation), and its conformal uncertainty layer achieves a calibration error of 0.0114 against a 90% target coverage level. Entity-linking recall is 0.8438 with precision of only 0.2191 (F1 = 0.3479); despite low linker precision, end-to-end accuracy remained at 100%, suggesting the downstream rule-check and graph-path scoring stages filter out most incorrectly-linked candidates before they affect the final determination — a mechanism this paper flags as requiring its own ablation rather than treating it as confirmed. CompGraphRAG's contribution is therefore positioned as a combination of a promising, mechanistically-explainable accuracy advantage together with audit-grade explainability and calibrated uncertainty quantification for compliance determination. The full statistical validation plan, threat model, and reproducibility package are reported so that this framing can be tested further at larger scale and against external graph-RAG baselines (Microsoft GraphRAG, LightRAG, HippoRAG); none of these three could be executed in the present environment, and each is marked as not measured rather than estimated.</w:t>
+      </w:r>
+    </w:p>
+    <w:p>
+      <w:pPr>
+        <w:spacing w:after="160"/>
+        <w:jc w:val="both"/>
+      </w:pPr>
+      <w:r>
+        <w:rPr>
+          <w:rFonts w:ascii="Times New Roman" w:cs="Times New Roman" w:eastAsia="Times New Roman" w:hAnsi="Times New Roman"/>
+          <w:b w:val="false"/>
+          <w:bCs w:val="false"/>
+          <w:i/>
+          <w:iCs/>
           <w:sz w:val="20"/>
           <w:szCs w:val="20"/>
         </w:rPr>
-        <w:t xml:space="preserve">EDITOR'S NOTE (delete before final submission): This is the full paper with every accuracy/ECE/p-value figure corrected to match the verbatim output of eval_harness.py (results/eval_results_raw.json). Table II, Fig. 3, and Fig. 5 have been replaced/regenerated; Fig. 1, Fig. 2, and Fig. 4 are unchanged from the original (Fig. 4's faithfulness value, 0.9679, did not change between drafts). New Section VII-E reports entity-linking precision/recall, promised in Section IV-C but missing from the prior draft. The GitHub README table still needs a separate update to match this version — that is tracked as a follow-up, not done in this file.</w:t>
-      </w:r>
-    </w:p>
-    <w:p>
-      <w:pPr>
-        <w:pStyle w:val="Heading2"/>
-        <w:spacing w:after="140" w:before="280"/>
-      </w:pPr>
-      <w:r>
-        <w:rPr>
-          <w:rFonts w:ascii="Times New Roman" w:cs="Times New Roman" w:eastAsia="Times New Roman" w:hAnsi="Times New Roman"/>
-          <w:b/>
-          <w:bCs/>
-          <w:i/>
-          <w:iCs/>
-          <w:sz w:val="22"/>
-          <w:szCs w:val="22"/>
-        </w:rPr>
-        <w:t xml:space="preserve">Abstract</w:t>
-      </w:r>
-    </w:p>
-    <w:p>
-      <w:pPr>
-        <w:spacing w:after="160"/>
-        <w:jc w:val="both"/>
-      </w:pPr>
-      <w:r>
-        <w:rPr>
-          <w:rFonts w:ascii="Times New Roman" w:cs="Times New Roman" w:eastAsia="Times New Roman" w:hAnsi="Times New Roman"/>
-          <w:b w:val="false"/>
-          <w:bCs w:val="false"/>
-          <w:i w:val="false"/>
-          <w:iCs w:val="false"/>
-          <w:sz w:val="22"/>
-          <w:szCs w:val="22"/>
-        </w:rPr>
-        <w:t xml:space="preserve">Enterprise compliance determination — for example, deciding whether a specific healthcare data disclosure satisfies HIPAA mandates — requires reasoning across relationally distributed, heterogeneous documents that include regulations, contracts, clinical policies, and access logs. Standard vector-based Retrieval-Augmented Generation (RAG) treats these documents as flat, isolated chunks and is hypothesized to degrade on multi-hop regulatory queries. Black-box large language model (LLM) outputs also lack auditable justification trails and calibrated uncertainty, which limits their suitability for high-stakes compliance auditing. We present CompGraphRAG, a framework that unifies (1) a schema-based knowledge graph ontology (TBox/ABox) with temporal versioning of regulatory concepts, (2) a formal hybrid retrieval scoring function combining dense bi-encoder similarity, graph-path decay, and Personalized PageRank node authority, (3) a neuro-symbolic rule-check layer that evaluates declarative regulatory exceptions prior to generation, (4) audit-grade explainability via traversable justification subgraphs scored with a quantitative faithfulness metric, and (5) split conformal prediction that furnishes distribution-free confidence sets and routes low-confidence determinations to human review.</w:t>
-      </w:r>
-    </w:p>
-    <w:p>
-      <w:pPr>
-        <w:spacing w:after="160"/>
-        <w:jc w:val="both"/>
-      </w:pPr>
-      <w:r>
-        <w:rPr>
-          <w:rFonts w:ascii="Times New Roman" w:cs="Times New Roman" w:eastAsia="Times New Roman" w:hAnsi="Times New Roman"/>
-          <w:b w:val="false"/>
-          <w:bCs w:val="false"/>
-          <w:i w:val="false"/>
-          <w:iCs w:val="false"/>
-          <w:sz w:val="22"/>
-          <w:szCs w:val="22"/>
-        </w:rPr>
-        <w:t xml:space="preserve">Compliance determination is formalized as a function f: Q × D × G → (d, c, π) and instantiated in a HIPAA case study. This manuscript reports results from a 24-item synthetic HIPAA compliance-QA benchmark (6 items at each of 1-, 2-, 3-, and 4-hop complexity), evaluated with a real sentence-embedding encoder (all-MiniLM-L6-v2) against two fairness-matched baselines that use the identical rule-based answer-readout step as CompGraphRAG: Vector-RAG (pure dense cosine-similarity retrieval) and Naive-RAG (a 0.5/0.5 blend of keyword overlap and dense similarity). This design isolates retrieval architecture as the variable under test, separating it from answer-extraction sophistication. Under this controlled comparison, CompGraphRAG achieved 100.0% overall accuracy (24/24), against 87.5% (21/24) for both the Vector-RAG and Naive-RAG baselines, tying both baselines at 3- and 4-hop and outperforming them at 1- and 2-hop (paired t-test p = 0.0830; Wilcoxon signed-rank p = 0.0833; N = 24). Neither test clears the conventional 0.05 significance threshold, and the effect size (Cohen's d ≈ 0.37) is small-to-medium, so this is reported as a promising but not yet statistically confirmed accuracy advantage, not as proof of the paper's original hop-scaling hypothesis.</w:t>
-      </w:r>
-    </w:p>
-    <w:p>
-      <w:pPr>
-        <w:spacing w:after="160"/>
-        <w:jc w:val="both"/>
-      </w:pPr>
-      <w:r>
-        <w:rPr>
-          <w:rFonts w:ascii="Times New Roman" w:cs="Times New Roman" w:eastAsia="Times New Roman" w:hAnsi="Times New Roman"/>
-          <w:b w:val="false"/>
-          <w:bCs w:val="false"/>
-          <w:i w:val="false"/>
-          <w:iCs w:val="false"/>
-          <w:sz w:val="22"/>
-          <w:szCs w:val="22"/>
-        </w:rPr>
-        <w:t xml:space="preserve">The same evaluation supports two further claims: CompGraphRAG's justification subgraphs and generated explanations are independently, non-tautologically faithful to retrieved evidence (mean F1 = 0.9679, verified against per-item natural-language generation with genuine content-dependent variation), and its conformal uncertainty layer achieves a calibration error of 0.0114 against a 90% target coverage level. Entity-linking recall is 0.8438 with precision of only 0.2191 (F1 = 0.3479); despite low linker precision, end-to-end accuracy remained at 100%, suggesting the downstream rule-check and graph-path scoring stages filter out most incorrectly-linked candidates before they affect the final determination — a mechanism this paper flags as requiring its own ablation rather than treating it as confirmed. CompGraphRAG's contribution is therefore positioned as a combination of a promising, mechanistically-explainable accuracy advantage together with audit-grade explainability and calibrated uncertainty quantification for compliance determination. The full statistical validation plan, threat model, and reproducibility package are reported so that this framing can be tested further at larger scale and against external graph-RAG baselines (Microsoft GraphRAG, LightRAG, HippoRAG); none of these three could be executed in the present environment, and each is marked as not measured rather than estimated.</w:t>
-      </w:r>
-    </w:p>
-    <w:p>
-      <w:pPr>
-        <w:spacing w:after="160"/>
-        <w:jc w:val="both"/>
-      </w:pPr>
-      <w:r>
-        <w:rPr>
-          <w:rFonts w:ascii="Times New Roman" w:cs="Times New Roman" w:eastAsia="Times New Roman" w:hAnsi="Times New Roman"/>
-          <w:b w:val="false"/>
-          <w:bCs w:val="false"/>
-          <w:i/>
-          <w:iCs/>
-          <w:sz w:val="20"/>
-          <w:szCs w:val="20"/>
-        </w:rPr>
         <w:t xml:space="preserve">Index Terms—Retrieval-Augmented Generation, Knowledge Graphs, Enterprise Compliance, HIPAA, Explainable AI, Conformal Prediction, Neuro-Symbolic Reasoning, Healthcare Informatics, Multi-Hop Question Answering, Uncertainty Quantification.</w:t>
       </w:r>
     </w:p>
@@ -256,7 +239,7 @@
           <w:sz w:val="22"/>
           <w:szCs w:val="22"/>
         </w:rPr>
-        <w:t xml:space="preserve">[CORRECTED] This paper set out to test one falsifiable, quantitative hypothesis: the marginal accuracy benefit of knowledge-graph-augmented retrieval over dense-vector retrieval should scale with the hop-distance of a query, meaning the harder the multi-hop reasoning required, the larger CompGraphRAG's advantage over a flat retrieval baseline should be. Under the controlled, fairness-matched evaluation described in Sections VI–VII, CompGraphRAG achieved 100.0% accuracy overall against 87.5% for both baselines, outperforming them specifically at 1- and 2-hop and tying at 3- and 4-hop — the opposite of a monotonically increasing advantage, and not yet statistically significant at this sample size (p ≈ 0.083, N=24). This is reported as the paper's primary empirical finding: a real, code-verified accuracy advantage exists, but its shape does not confirm the original hop-scaling hypothesis, and its significance is not yet established. What the same evaluation also supports, and what is contributed as a second, independent systems claim, is an audit-grade architecture (Fig. 2) in which explainability and calibrated uncertainty are first-class, independently-measured outputs of the pipeline rather than post-hoc narration; Section VII verifies both to be non-tautological and genuinely content-sensitive.</w:t>
+        <w:t xml:space="preserve">This paper set out to test one falsifiable, quantitative hypothesis: the marginal accuracy benefit of knowledge-graph-augmented retrieval over dense-vector retrieval should scale with the hop-distance of a query, meaning the harder the multi-hop reasoning required, the larger CompGraphRAG's advantage over a flat retrieval baseline should be. Under the controlled, fairness-matched evaluation described in Sections VI–VII, CompGraphRAG achieved 100.0% accuracy overall against 87.5% for both baselines, outperforming them specifically at 1- and 2-hop and tying at 3- and 4-hop — the opposite of a monotonically increasing advantage, and not yet statistically significant at this sample size (p ≈ 0.083, N=24). This is reported as the paper's primary empirical finding: a real, code-verified accuracy advantage exists, but its shape does not confirm the original hop-scaling hypothesis, and its significance is not yet established. What the same evaluation also supports, and what is contributed as a second, independent systems claim, is an audit-grade architecture (Fig. 2) in which explainability and calibrated uncertainty are first-class, independently-measured outputs of the pipeline rather than post-hoc narration; Section VII verifies both to be non-tautological and genuinely content-sensitive.</w:t>
       </w:r>
     </w:p>
     <w:p>
@@ -2296,7 +2279,7 @@
           <w:sz w:val="22"/>
           <w:szCs w:val="22"/>
         </w:rPr>
-        <w:t xml:space="preserve">[CORRECTED — see editor's note] The results below are drawn from the verbatim JSON output of eval/eval_harness.py (results/eval_results_raw.json), run against datasets/hipaa_gold_dataset.json with the real all-MiniLM-L6-v2 encoder and fairness-matched baseline readouts. This replaces the previous draft's Table II, Fig. 3, and Fig. 5, which did not match the harness's current output.</w:t>
+        <w:t xml:space="preserve">The results below are drawn from the verbatim JSON output of eval/eval_harness.py (results/eval_results_raw.json), run against datasets/hipaa_gold_dataset.json with the real all-MiniLM-L6-v2 encoder and fairness-matched baseline readouts. This replaces the previous draft's Table II, Fig. 3, and Fig. 5, which did not match the harness's current output.</w:t>
       </w:r>
     </w:p>
     <w:p>
@@ -3857,7 +3840,7 @@
           <w:sz w:val="22"/>
           <w:szCs w:val="22"/>
         </w:rPr>
-        <w:t xml:space="preserve">[CORRECTED] This paper formalized enterprise compliance determination as a function over a query, a document corpus, and a typed knowledge graph, and presented CompGraphRAG, a framework combining a schema-based HIPAA ontology (Fig. 1), a hybrid dense/graph/authority retrieval scoring function, a neuro-symbolic rule-check layer, audit-grade explainability with a quantitative faithfulness metric, and split-conformal uncertainty quantification with safety routing (Fig. 2). A 24-item benchmark, evaluated with the real all-MiniLM-L6-v2 encoder against two fairness-matched baselines, showed CompGraphRAG achieving 100.0% accuracy (24/24) against 87.5% (21/24) for both Vector-RAG and Naive-RAG (paired t-test p = 0.0830; Wilcoxon p = 0.0833; Fig. 3), with the advantage concentrated at 1- and 2-hop rather than scaling with hop distance as the original H4/H8 hypothesis predicted, and not yet statistically significant at N=24 (Cohen's d ≈ 0.37, power ≈ 40%). The same evaluation supports CompGraphRAG on two dimensions substantially independent of this accuracy result: non-tautological explanation faithfulness (0.9679, Fig. 4) and a calibrated conformal uncertainty layer (ECE 0.0114). A newly reported entity-linking precision of 0.2191, despite recall of 0.8438, did not prevent 100% end-to-end accuracy — a finding flagged as requiring the ablation in Section VIII-B before it can be trusted as a robust property of the architecture rather than a benchmark-specific artifact.</w:t>
+        <w:t xml:space="preserve">This paper formalized enterprise compliance determination as a function over a query, a document corpus, and a typed knowledge graph, and presented CompGraphRAG, a framework combining a schema-based HIPAA ontology (Fig. 1), a hybrid dense/graph/authority retrieval scoring function, a neuro-symbolic rule-check layer, audit-grade explainability with a quantitative faithfulness metric, and split-conformal uncertainty quantification with safety routing (Fig. 2). A 24-item benchmark, evaluated with the real all-MiniLM-L6-v2 encoder against two fairness-matched baselines, showed CompGraphRAG achieving 100.0% accuracy (24/24) against 87.5% (21/24) for both Vector-RAG and Naive-RAG (paired t-test p = 0.0830; Wilcoxon p = 0.0833; Fig. 3), with the advantage concentrated at 1- and 2-hop rather than scaling with hop distance as the original H4/H8 hypothesis predicted, and not yet statistically significant at N=24 (Cohen's d ≈ 0.37, power ≈ 40%). The same evaluation supports CompGraphRAG on two dimensions substantially independent of this accuracy result: non-tautological explanation faithfulness (0.9679, Fig. 4) and a calibrated conformal uncertainty layer (ECE 0.0114). A newly reported entity-linking precision of 0.2191, despite recall of 0.8438, did not prevent 100% end-to-end accuracy — a finding flagged as requiring the ablation in Section VIII-B before it can be trusted as a robust property of the architecture rather than a benchmark-specific artifact.</w:t>
       </w:r>
     </w:p>
     <w:p>
@@ -3902,7 +3885,16 @@
         <w:jc w:val="both"/>
       </w:pPr>
       <w:r>
-        <w:t>The reference implementation, the N=24 benchmark dataset, the evaluation harness (eval/eval_harness.py) used to produce Table II, Fig. 3, and Fig. 5, the baseline runner (baselines/runner.py), and the schema/prompt/rule-configuration artifacts described in Section IV are released under the MIT license at https://github.com/12349/CompGraphRAG. All numbers reported in this revision were regenerated directly from this repository's evaluation harness output. The exact commit hash corresponding to this manuscript's final results is ddf7a99b36e70e236f7f65f9080ddcc8d16ff632 (tagged as v1.0-paper).</w:t>
+        <w:rPr>
+          <w:rFonts w:ascii="Times New Roman" w:cs="Times New Roman" w:eastAsia="Times New Roman" w:hAnsi="Times New Roman"/>
+          <w:b w:val="false"/>
+          <w:bCs w:val="false"/>
+          <w:i w:val="false"/>
+          <w:iCs w:val="false"/>
+          <w:sz w:val="20"/>
+          <w:szCs w:val="20"/>
+        </w:rPr>
+        <w:t xml:space="preserve">The reference implementation, the N=24 benchmark dataset, the evaluation harness (eval/eval_harness.py) used to produce Table II, Fig. 3, and Fig. 5, the baseline runner (baselines/runner.py), and the schema/prompt/rule-configuration artifacts described in Section IV are released under the MIT license at https://github.com/12349/CompGraphRAG. All numbers reported in this manuscript were regenerated directly from this repository's evaluation harness output. The exact commit hash corresponding to this manuscript's final results is ddf7a99b36e70e236f7f65f9080ddcc8d16ff632 (tagged as v1.0-paper).</w:t>
       </w:r>
     </w:p>
     <w:p>

</xml_diff>